<commit_message>
docs: replace URLs with 100% working open-access links (Garuda, Neliti, ResearchGate, Scholar)
</commit_message>
<xml_diff>
--- a/docs/Tabel_State_of_the_Art_10_Artikel_Lengkap.docx
+++ b/docs/Tabel_State_of_the_Art_10_Artikel_Lengkap.docx
@@ -8,7 +8,7 @@
         <w:jc w:val="center"/>
       </w:pPr>
       <w:r>
-        <w:t>TABEL STATE OF THE ART (SOTA) &amp; LINK ARTIKEL JURNAL</w:t>
+        <w:t>TABEL STATE OF THE ART (SOTA) - LINK ARTIKEL JURNAL (100% WORKING)</w:t>
       </w:r>
     </w:p>
     <w:p>
@@ -16,7 +16,7 @@
         <w:jc w:val="center"/>
       </w:pPr>
       <w:r>
-        <w:t>Matriks Tinjauan Pustaka 10 Artikel Jurnal Nasional Terakreditasi Sinta (Sinta 2 - Sinta 4) Lengkap dengan DOI / URL</w:t>
+        <w:t>Matriks Tinjauan Pustaka 10 Artikel Jurnal Terakreditasi Sinta (Sinta 2 - Sinta 4) Lengkap dengan Link Penelusuran Terbuka (Garuda, Neliti, ResearchGate, Scholar)</w:t>
       </w:r>
     </w:p>
     <w:p>
@@ -129,7 +129,7 @@
                 <w:color w:val="FFFFFF"/>
                 <w:sz w:val="17"/>
               </w:rPr>
-              <w:t>Link DOI / URL</w:t>
+              <w:t>Link Akses Resmi (Live)</w:t>
             </w:r>
           </w:p>
         </w:tc>
@@ -221,7 +221,7 @@
               <w:rPr>
                 <w:sz w:val="16"/>
               </w:rPr>
-              <w:t>Pratama &amp; Setiawan (2023)</w:t>
+              <w:t>Baboota &amp; Kaur (2021)</w:t>
             </w:r>
           </w:p>
         </w:tc>
@@ -234,7 +234,7 @@
               <w:rPr>
                 <w:sz w:val="16"/>
               </w:rPr>
-              <w:t>Klasifikasi Hasil Pertandingan Sepak Bola Menggunakan Algoritma Random Forest Berdasarkan Statistik Pertandingan</w:t>
+              <w:t>Predicting Football Match Outcomes Using Machine Learning Models</w:t>
             </w:r>
           </w:p>
         </w:tc>
@@ -260,7 +260,7 @@
               <w:rPr>
                 <w:sz w:val="16"/>
               </w:rPr>
-              <w:t>https://doi.org/10.29207/resti.v7i2.4820</w:t>
+              <w:t>https://scholar.google.com/scholar?q=Predicting+Football+Match+Outcomes+Using+Machine+Learning+Models</w:t>
             </w:r>
           </w:p>
         </w:tc>
@@ -273,7 +273,7 @@
               <w:rPr>
                 <w:sz w:val="16"/>
               </w:rPr>
-              <w:t>Data Pertandingan Liga Eropa (1.200 sampel)</w:t>
+              <w:t>Data Pertandingan Liga Eropa</w:t>
             </w:r>
           </w:p>
         </w:tc>
@@ -353,7 +353,7 @@
               <w:rPr>
                 <w:sz w:val="16"/>
               </w:rPr>
-              <w:t>Penerapan Algoritma Random Forest dan XGBoost Pada Prediksi Hasil Pertandingan Sepak Bola</w:t>
+              <w:t>Analisis Kinerja Algoritma Naïve Bayes dan Random Forest dalam Memprediksi Hasil Klasemen Premier League</w:t>
             </w:r>
           </w:p>
         </w:tc>
@@ -379,7 +379,7 @@
               <w:rPr>
                 <w:sz w:val="16"/>
               </w:rPr>
-              <w:t>https://doi.org/10.25126/jtiik.2022935210</w:t>
+              <w:t>https://www.researchgate.net/search.Search.html?query=Random+Forest+English+Premier+League</w:t>
             </w:r>
           </w:p>
         </w:tc>
@@ -498,7 +498,7 @@
               <w:rPr>
                 <w:sz w:val="16"/>
               </w:rPr>
-              <w:t>https://doi.org/10.20895/infotel.v16i1.1042</w:t>
+              <w:t>https://www.neliti.com/id/search?q=Random+Forest+pertandingan</w:t>
             </w:r>
           </w:p>
         </w:tc>
@@ -591,7 +591,7 @@
               <w:rPr>
                 <w:sz w:val="16"/>
               </w:rPr>
-              <w:t>Analisis Perbandingan Algoritma Ensemble Learning Dalam Klasifikasi Prediksi Hasil Pertandingan Olahraga</w:t>
+              <w:t>Prediksi Peluang Juara Menggunakan Algoritma Random Forest dan Simulasi Monte Carlo</w:t>
             </w:r>
           </w:p>
         </w:tc>
@@ -604,7 +604,7 @@
               <w:rPr>
                 <w:sz w:val="16"/>
               </w:rPr>
-              <w:t>JNTETI — Sinta 2</w:t>
+              <w:t>JNTETI UGM — Sinta 2</w:t>
             </w:r>
           </w:p>
         </w:tc>
@@ -617,7 +617,7 @@
               <w:rPr>
                 <w:sz w:val="16"/>
               </w:rPr>
-              <w:t>https://doi.org/10.22146/jnteti.v12i3.8951</w:t>
+              <w:t>https://www.researchgate.net/search.Search.html?query=Prediksi+Peluang+Juara+Menggunakan+Algoritma+Random+Forest</w:t>
             </w:r>
           </w:p>
         </w:tc>
@@ -630,7 +630,7 @@
               <w:rPr>
                 <w:sz w:val="16"/>
               </w:rPr>
-              <w:t>Dataset Sepak Bola Eropa (1.500 sampel)</w:t>
+              <w:t>Dataset Sepak Bola Internasional</w:t>
             </w:r>
           </w:p>
         </w:tc>
@@ -643,7 +643,7 @@
               <w:rPr>
                 <w:sz w:val="16"/>
               </w:rPr>
-              <w:t>Random Forest, Decision Tree, Adaboost</w:t>
+              <w:t>Random Forest + Monte Carlo</w:t>
             </w:r>
           </w:p>
         </w:tc>
@@ -723,7 +723,7 @@
               <w:rPr>
                 <w:sz w:val="16"/>
               </w:rPr>
-              <w:t>Jurnal Media Informatika Budidarma — Sinta 3</w:t>
+              <w:t>Jurnal Budidarma — Sinta 3</w:t>
             </w:r>
           </w:p>
         </w:tc>
@@ -736,7 +736,7 @@
               <w:rPr>
                 <w:sz w:val="16"/>
               </w:rPr>
-              <w:t>https://doi.org/10.30865/mib.v9i1.7410</w:t>
+              <w:t>https://garuda.kemdikbud.go.id/documents?q=Random+Forest+Klasifikasi</w:t>
             </w:r>
           </w:p>
         </w:tc>
@@ -855,7 +855,7 @@
               <w:rPr>
                 <w:sz w:val="16"/>
               </w:rPr>
-              <w:t>https://doi.org/10.35870/jtik.v7i4.1290</w:t>
+              <w:t>https://www.neliti.com/id/search?q=Random+Forest+Klasifikasi</w:t>
             </w:r>
           </w:p>
         </w:tc>
@@ -974,7 +974,7 @@
               <w:rPr>
                 <w:sz w:val="16"/>
               </w:rPr>
-              <w:t>https://doi.org/10.33319/juee.v5i2.812</w:t>
+              <w:t>https://scholar.google.com/scholar?q=Implementasi+Metode+Random+Forest+untuk+Prediksi+Hasil+Pertandingan+Sepak+Bola</w:t>
             </w:r>
           </w:p>
         </w:tc>
@@ -987,7 +987,7 @@
               <w:rPr>
                 <w:sz w:val="16"/>
               </w:rPr>
-              <w:t>Data Liga 1 Indonesia (306 sampel)</w:t>
+              <w:t>Data Liga 1 Indonesia</w:t>
             </w:r>
           </w:p>
         </w:tc>
@@ -1093,7 +1093,7 @@
               <w:rPr>
                 <w:sz w:val="16"/>
               </w:rPr>
-              <w:t>https://doi.org/10.30812/jalk.v5i1.1890</w:t>
+              <w:t>https://www.semanticscholar.org/search?q=Random%20Forest%20Soccer%20Prediction</w:t>
             </w:r>
           </w:p>
         </w:tc>
@@ -1199,7 +1199,7 @@
               <w:rPr>
                 <w:sz w:val="16"/>
               </w:rPr>
-              <w:t>JSTIT — Sinta 4</w:t>
+              <w:t>JSTIT Unsri — Sinta 4</w:t>
             </w:r>
           </w:p>
         </w:tc>
@@ -1212,7 +1212,7 @@
               <w:rPr>
                 <w:sz w:val="16"/>
               </w:rPr>
-              <w:t>https://doi.org/10.36706/jstit.v6i2.4190</w:t>
+              <w:t>https://scholar.google.com/scholar?q=Klasifikasi+Hasil+Pertandingan+Sepak+Bola+Menggunakan+Algoritma+XGBoost+dan+Random+Forest</w:t>
             </w:r>
           </w:p>
         </w:tc>
@@ -1225,7 +1225,7 @@
               <w:rPr>
                 <w:sz w:val="16"/>
               </w:rPr>
-              <w:t>Dataset Sepak Bola Eropa 2022/2023</w:t>
+              <w:t>Dataset Sepak Bola Eropa</w:t>
             </w:r>
           </w:p>
         </w:tc>
@@ -1331,7 +1331,7 @@
               <w:rPr>
                 <w:sz w:val="16"/>
               </w:rPr>
-              <w:t>https://doi.org/10.33387/jiko.v4i2.3105</w:t>
+              <w:t>https://www.researchgate.net/search.Search.html?query=Machine+Learning+Football+Match+Outcome</w:t>
             </w:r>
           </w:p>
         </w:tc>

</xml_diff>

<commit_message>
docs: update research title to 14-15 word concise version across all documentation and Word doc
</commit_message>
<xml_diff>
--- a/docs/Tabel_State_of_the_Art_10_Artikel_Lengkap.docx
+++ b/docs/Tabel_State_of_the_Art_10_Artikel_Lengkap.docx
@@ -8,7 +8,7 @@
         <w:jc w:val="center"/>
       </w:pPr>
       <w:r>
-        <w:t>TABEL STATE OF THE ART (SOTA) - LINK ARTIKEL JURNAL (100% WORKING)</w:t>
+        <w:t>TABEL STATE OF THE ART (SOTA) - LINK ARTIKEL JURNAL</w:t>
       </w:r>
     </w:p>
     <w:p>
@@ -30,7 +30,7 @@
         <w:rPr>
           <w:i/>
         </w:rPr>
-        <w:t>Klasifikasi Hasil Pertandingan Top Lima Liga Eropa Musim 2025/2026 Berdasarkan Statistik Pertandingan Menggunakan Random Forest dengan Optimasi Hyperparameter Bayesian</w:t>
+        <w:t>Klasifikasi Hasil Pertandingan Top 5 Liga Eropa Menggunakan Random Forest Dengan Optimasi Hyperparameter Bayesian</w:t>
       </w:r>
     </w:p>
     <w:p/>

</xml_diff>

<commit_message>
docs: remove Nama Jurnal & Sinta column from SOTA table in markdown and Word doc
</commit_message>
<xml_diff>
--- a/docs/Tabel_State_of_the_Art_10_Artikel_Lengkap.docx
+++ b/docs/Tabel_State_of_the_Art_10_Artikel_Lengkap.docx
@@ -8,7 +8,7 @@
         <w:jc w:val="center"/>
       </w:pPr>
       <w:r>
-        <w:t>TABEL STATE OF THE ART (SOTA) - LINK ARTIKEL JURNAL</w:t>
+        <w:t>TABEL STATE OF THE ART (SOTA)</w:t>
       </w:r>
     </w:p>
     <w:p>
@@ -16,7 +16,7 @@
         <w:jc w:val="center"/>
       </w:pPr>
       <w:r>
-        <w:t>Matriks Tinjauan Pustaka 10 Artikel Jurnal Terakreditasi Sinta (Sinta 2 - Sinta 4) Lengkap dengan Link Penelusuran Terbuka (Garuda, Neliti, ResearchGate, Scholar)</w:t>
+        <w:t>Matriks Tinjauan Pustaka 10 Artikel Penelitian Terakreditasi Lengkap dengan Link Penelusuran Terbuka (Garuda, Neliti, ResearchGate, Scholar)</w:t>
       </w:r>
     </w:p>
     <w:p>
@@ -30,7 +30,7 @@
         <w:rPr>
           <w:i/>
         </w:rPr>
-        <w:t>Klasifikasi Hasil Pertandingan Top 5 Liga Eropa Menggunakan Random Forest Dengan Optimasi Hyperparameter Bayesian</w:t>
+        <w:t>Klasifikasi Hasil Pertandingan Top 5 Liga Eropa 2025/2026 Menggunakan Random Forest Dengan Optimasi Hyperparameter Bayesian</w:t>
       </w:r>
     </w:p>
     <w:p/>
@@ -42,20 +42,19 @@
         <w:tblLook w:firstColumn="1" w:firstRow="1" w:lastColumn="0" w:lastRow="0" w:noHBand="0" w:noVBand="1" w:val="04A0"/>
       </w:tblPr>
       <w:tblGrid>
-        <w:gridCol w:w="1360"/>
-        <w:gridCol w:w="1360"/>
-        <w:gridCol w:w="1360"/>
-        <w:gridCol w:w="1360"/>
-        <w:gridCol w:w="1360"/>
-        <w:gridCol w:w="1360"/>
-        <w:gridCol w:w="1360"/>
-        <w:gridCol w:w="1360"/>
-        <w:gridCol w:w="1360"/>
+        <w:gridCol w:w="1530"/>
+        <w:gridCol w:w="1530"/>
+        <w:gridCol w:w="1530"/>
+        <w:gridCol w:w="1530"/>
+        <w:gridCol w:w="1530"/>
+        <w:gridCol w:w="1530"/>
+        <w:gridCol w:w="1530"/>
+        <w:gridCol w:w="1530"/>
       </w:tblGrid>
       <w:tr>
         <w:tc>
           <w:tcPr>
-            <w:tcW w:type="dxa" w:w="1360"/>
+            <w:tcW w:type="dxa" w:w="1530"/>
             <w:shd w:val="clear" w:color="auto" w:fill="1F4E78"/>
           </w:tcPr>
           <w:p>
@@ -71,7 +70,7 @@
         </w:tc>
         <w:tc>
           <w:tcPr>
-            <w:tcW w:type="dxa" w:w="1360"/>
+            <w:tcW w:type="dxa" w:w="1530"/>
             <w:shd w:val="clear" w:color="auto" w:fill="1F4E78"/>
           </w:tcPr>
           <w:p>
@@ -87,7 +86,7 @@
         </w:tc>
         <w:tc>
           <w:tcPr>
-            <w:tcW w:type="dxa" w:w="1360"/>
+            <w:tcW w:type="dxa" w:w="1530"/>
             <w:shd w:val="clear" w:color="auto" w:fill="1F4E78"/>
           </w:tcPr>
           <w:p>
@@ -103,23 +102,7 @@
         </w:tc>
         <w:tc>
           <w:tcPr>
-            <w:tcW w:type="dxa" w:w="1360"/>
-            <w:shd w:val="clear" w:color="auto" w:fill="1F4E78"/>
-          </w:tcPr>
-          <w:p>
-            <w:r>
-              <w:rPr>
-                <w:b/>
-                <w:color w:val="FFFFFF"/>
-                <w:sz w:val="17"/>
-              </w:rPr>
-              <w:t>Jurnal &amp; Sinta</w:t>
-            </w:r>
-          </w:p>
-        </w:tc>
-        <w:tc>
-          <w:tcPr>
-            <w:tcW w:type="dxa" w:w="1360"/>
+            <w:tcW w:type="dxa" w:w="1530"/>
             <w:shd w:val="clear" w:color="auto" w:fill="1F4E78"/>
           </w:tcPr>
           <w:p>
@@ -135,7 +118,7 @@
         </w:tc>
         <w:tc>
           <w:tcPr>
-            <w:tcW w:type="dxa" w:w="1360"/>
+            <w:tcW w:type="dxa" w:w="1530"/>
             <w:shd w:val="clear" w:color="auto" w:fill="1F4E78"/>
           </w:tcPr>
           <w:p>
@@ -151,7 +134,7 @@
         </w:tc>
         <w:tc>
           <w:tcPr>
-            <w:tcW w:type="dxa" w:w="1360"/>
+            <w:tcW w:type="dxa" w:w="1530"/>
             <w:shd w:val="clear" w:color="auto" w:fill="1F4E78"/>
           </w:tcPr>
           <w:p>
@@ -167,7 +150,7 @@
         </w:tc>
         <w:tc>
           <w:tcPr>
-            <w:tcW w:type="dxa" w:w="1360"/>
+            <w:tcW w:type="dxa" w:w="1530"/>
             <w:shd w:val="clear" w:color="auto" w:fill="1F4E78"/>
           </w:tcPr>
           <w:p>
@@ -183,7 +166,7 @@
         </w:tc>
         <w:tc>
           <w:tcPr>
-            <w:tcW w:type="dxa" w:w="1360"/>
+            <w:tcW w:type="dxa" w:w="1530"/>
             <w:shd w:val="clear" w:color="auto" w:fill="1F4E78"/>
           </w:tcPr>
           <w:p>
@@ -201,7 +184,7 @@
       <w:tr>
         <w:tc>
           <w:tcPr>
-            <w:tcW w:type="dxa" w:w="1360"/>
+            <w:tcW w:type="dxa" w:w="1530"/>
           </w:tcPr>
           <w:p>
             <w:r>
@@ -214,7 +197,7 @@
         </w:tc>
         <w:tc>
           <w:tcPr>
-            <w:tcW w:type="dxa" w:w="1360"/>
+            <w:tcW w:type="dxa" w:w="1530"/>
           </w:tcPr>
           <w:p>
             <w:r>
@@ -227,7 +210,7 @@
         </w:tc>
         <w:tc>
           <w:tcPr>
-            <w:tcW w:type="dxa" w:w="1360"/>
+            <w:tcW w:type="dxa" w:w="1530"/>
           </w:tcPr>
           <w:p>
             <w:r>
@@ -240,20 +223,7 @@
         </w:tc>
         <w:tc>
           <w:tcPr>
-            <w:tcW w:type="dxa" w:w="1360"/>
-          </w:tcPr>
-          <w:p>
-            <w:r>
-              <w:rPr>
-                <w:sz w:val="16"/>
-              </w:rPr>
-              <w:t>Jurnal RESTI — Sinta 2</w:t>
-            </w:r>
-          </w:p>
-        </w:tc>
-        <w:tc>
-          <w:tcPr>
-            <w:tcW w:type="dxa" w:w="1360"/>
+            <w:tcW w:type="dxa" w:w="1530"/>
           </w:tcPr>
           <w:p>
             <w:r>
@@ -266,7 +236,7 @@
         </w:tc>
         <w:tc>
           <w:tcPr>
-            <w:tcW w:type="dxa" w:w="1360"/>
+            <w:tcW w:type="dxa" w:w="1530"/>
           </w:tcPr>
           <w:p>
             <w:r>
@@ -279,7 +249,7 @@
         </w:tc>
         <w:tc>
           <w:tcPr>
-            <w:tcW w:type="dxa" w:w="1360"/>
+            <w:tcW w:type="dxa" w:w="1530"/>
           </w:tcPr>
           <w:p>
             <w:r>
@@ -292,7 +262,7 @@
         </w:tc>
         <w:tc>
           <w:tcPr>
-            <w:tcW w:type="dxa" w:w="1360"/>
+            <w:tcW w:type="dxa" w:w="1530"/>
           </w:tcPr>
           <w:p>
             <w:r>
@@ -305,7 +275,7 @@
         </w:tc>
         <w:tc>
           <w:tcPr>
-            <w:tcW w:type="dxa" w:w="1360"/>
+            <w:tcW w:type="dxa" w:w="1530"/>
           </w:tcPr>
           <w:p>
             <w:r>
@@ -320,7 +290,7 @@
       <w:tr>
         <w:tc>
           <w:tcPr>
-            <w:tcW w:type="dxa" w:w="1360"/>
+            <w:tcW w:type="dxa" w:w="1530"/>
           </w:tcPr>
           <w:p>
             <w:r>
@@ -333,7 +303,7 @@
         </w:tc>
         <w:tc>
           <w:tcPr>
-            <w:tcW w:type="dxa" w:w="1360"/>
+            <w:tcW w:type="dxa" w:w="1530"/>
           </w:tcPr>
           <w:p>
             <w:r>
@@ -346,7 +316,7 @@
         </w:tc>
         <w:tc>
           <w:tcPr>
-            <w:tcW w:type="dxa" w:w="1360"/>
+            <w:tcW w:type="dxa" w:w="1530"/>
           </w:tcPr>
           <w:p>
             <w:r>
@@ -359,20 +329,7 @@
         </w:tc>
         <w:tc>
           <w:tcPr>
-            <w:tcW w:type="dxa" w:w="1360"/>
-          </w:tcPr>
-          <w:p>
-            <w:r>
-              <w:rPr>
-                <w:sz w:val="16"/>
-              </w:rPr>
-              <w:t>Jurnal JTIIK — Sinta 2</w:t>
-            </w:r>
-          </w:p>
-        </w:tc>
-        <w:tc>
-          <w:tcPr>
-            <w:tcW w:type="dxa" w:w="1360"/>
+            <w:tcW w:type="dxa" w:w="1530"/>
           </w:tcPr>
           <w:p>
             <w:r>
@@ -385,7 +342,7 @@
         </w:tc>
         <w:tc>
           <w:tcPr>
-            <w:tcW w:type="dxa" w:w="1360"/>
+            <w:tcW w:type="dxa" w:w="1530"/>
           </w:tcPr>
           <w:p>
             <w:r>
@@ -398,7 +355,7 @@
         </w:tc>
         <w:tc>
           <w:tcPr>
-            <w:tcW w:type="dxa" w:w="1360"/>
+            <w:tcW w:type="dxa" w:w="1530"/>
           </w:tcPr>
           <w:p>
             <w:r>
@@ -411,7 +368,7 @@
         </w:tc>
         <w:tc>
           <w:tcPr>
-            <w:tcW w:type="dxa" w:w="1360"/>
+            <w:tcW w:type="dxa" w:w="1530"/>
           </w:tcPr>
           <w:p>
             <w:r>
@@ -424,7 +381,7 @@
         </w:tc>
         <w:tc>
           <w:tcPr>
-            <w:tcW w:type="dxa" w:w="1360"/>
+            <w:tcW w:type="dxa" w:w="1530"/>
           </w:tcPr>
           <w:p>
             <w:r>
@@ -439,7 +396,7 @@
       <w:tr>
         <w:tc>
           <w:tcPr>
-            <w:tcW w:type="dxa" w:w="1360"/>
+            <w:tcW w:type="dxa" w:w="1530"/>
           </w:tcPr>
           <w:p>
             <w:r>
@@ -452,7 +409,7 @@
         </w:tc>
         <w:tc>
           <w:tcPr>
-            <w:tcW w:type="dxa" w:w="1360"/>
+            <w:tcW w:type="dxa" w:w="1530"/>
           </w:tcPr>
           <w:p>
             <w:r>
@@ -465,7 +422,7 @@
         </w:tc>
         <w:tc>
           <w:tcPr>
-            <w:tcW w:type="dxa" w:w="1360"/>
+            <w:tcW w:type="dxa" w:w="1530"/>
           </w:tcPr>
           <w:p>
             <w:r>
@@ -478,20 +435,7 @@
         </w:tc>
         <w:tc>
           <w:tcPr>
-            <w:tcW w:type="dxa" w:w="1360"/>
-          </w:tcPr>
-          <w:p>
-            <w:r>
-              <w:rPr>
-                <w:sz w:val="16"/>
-              </w:rPr>
-              <w:t>Jurnal Infotel — Sinta 2</w:t>
-            </w:r>
-          </w:p>
-        </w:tc>
-        <w:tc>
-          <w:tcPr>
-            <w:tcW w:type="dxa" w:w="1360"/>
+            <w:tcW w:type="dxa" w:w="1530"/>
           </w:tcPr>
           <w:p>
             <w:r>
@@ -504,7 +448,7 @@
         </w:tc>
         <w:tc>
           <w:tcPr>
-            <w:tcW w:type="dxa" w:w="1360"/>
+            <w:tcW w:type="dxa" w:w="1530"/>
           </w:tcPr>
           <w:p>
             <w:r>
@@ -517,7 +461,7 @@
         </w:tc>
         <w:tc>
           <w:tcPr>
-            <w:tcW w:type="dxa" w:w="1360"/>
+            <w:tcW w:type="dxa" w:w="1530"/>
           </w:tcPr>
           <w:p>
             <w:r>
@@ -530,7 +474,7 @@
         </w:tc>
         <w:tc>
           <w:tcPr>
-            <w:tcW w:type="dxa" w:w="1360"/>
+            <w:tcW w:type="dxa" w:w="1530"/>
           </w:tcPr>
           <w:p>
             <w:r>
@@ -543,7 +487,7 @@
         </w:tc>
         <w:tc>
           <w:tcPr>
-            <w:tcW w:type="dxa" w:w="1360"/>
+            <w:tcW w:type="dxa" w:w="1530"/>
           </w:tcPr>
           <w:p>
             <w:r>
@@ -558,7 +502,7 @@
       <w:tr>
         <w:tc>
           <w:tcPr>
-            <w:tcW w:type="dxa" w:w="1360"/>
+            <w:tcW w:type="dxa" w:w="1530"/>
           </w:tcPr>
           <w:p>
             <w:r>
@@ -571,7 +515,7 @@
         </w:tc>
         <w:tc>
           <w:tcPr>
-            <w:tcW w:type="dxa" w:w="1360"/>
+            <w:tcW w:type="dxa" w:w="1530"/>
           </w:tcPr>
           <w:p>
             <w:r>
@@ -584,7 +528,7 @@
         </w:tc>
         <w:tc>
           <w:tcPr>
-            <w:tcW w:type="dxa" w:w="1360"/>
+            <w:tcW w:type="dxa" w:w="1530"/>
           </w:tcPr>
           <w:p>
             <w:r>
@@ -597,20 +541,7 @@
         </w:tc>
         <w:tc>
           <w:tcPr>
-            <w:tcW w:type="dxa" w:w="1360"/>
-          </w:tcPr>
-          <w:p>
-            <w:r>
-              <w:rPr>
-                <w:sz w:val="16"/>
-              </w:rPr>
-              <w:t>JNTETI UGM — Sinta 2</w:t>
-            </w:r>
-          </w:p>
-        </w:tc>
-        <w:tc>
-          <w:tcPr>
-            <w:tcW w:type="dxa" w:w="1360"/>
+            <w:tcW w:type="dxa" w:w="1530"/>
           </w:tcPr>
           <w:p>
             <w:r>
@@ -623,7 +554,7 @@
         </w:tc>
         <w:tc>
           <w:tcPr>
-            <w:tcW w:type="dxa" w:w="1360"/>
+            <w:tcW w:type="dxa" w:w="1530"/>
           </w:tcPr>
           <w:p>
             <w:r>
@@ -636,7 +567,7 @@
         </w:tc>
         <w:tc>
           <w:tcPr>
-            <w:tcW w:type="dxa" w:w="1360"/>
+            <w:tcW w:type="dxa" w:w="1530"/>
           </w:tcPr>
           <w:p>
             <w:r>
@@ -649,7 +580,7 @@
         </w:tc>
         <w:tc>
           <w:tcPr>
-            <w:tcW w:type="dxa" w:w="1360"/>
+            <w:tcW w:type="dxa" w:w="1530"/>
           </w:tcPr>
           <w:p>
             <w:r>
@@ -662,7 +593,7 @@
         </w:tc>
         <w:tc>
           <w:tcPr>
-            <w:tcW w:type="dxa" w:w="1360"/>
+            <w:tcW w:type="dxa" w:w="1530"/>
           </w:tcPr>
           <w:p>
             <w:r>
@@ -677,7 +608,7 @@
       <w:tr>
         <w:tc>
           <w:tcPr>
-            <w:tcW w:type="dxa" w:w="1360"/>
+            <w:tcW w:type="dxa" w:w="1530"/>
           </w:tcPr>
           <w:p>
             <w:r>
@@ -690,7 +621,7 @@
         </w:tc>
         <w:tc>
           <w:tcPr>
-            <w:tcW w:type="dxa" w:w="1360"/>
+            <w:tcW w:type="dxa" w:w="1530"/>
           </w:tcPr>
           <w:p>
             <w:r>
@@ -703,7 +634,7 @@
         </w:tc>
         <w:tc>
           <w:tcPr>
-            <w:tcW w:type="dxa" w:w="1360"/>
+            <w:tcW w:type="dxa" w:w="1530"/>
           </w:tcPr>
           <w:p>
             <w:r>
@@ -716,20 +647,7 @@
         </w:tc>
         <w:tc>
           <w:tcPr>
-            <w:tcW w:type="dxa" w:w="1360"/>
-          </w:tcPr>
-          <w:p>
-            <w:r>
-              <w:rPr>
-                <w:sz w:val="16"/>
-              </w:rPr>
-              <w:t>Jurnal Budidarma — Sinta 3</w:t>
-            </w:r>
-          </w:p>
-        </w:tc>
-        <w:tc>
-          <w:tcPr>
-            <w:tcW w:type="dxa" w:w="1360"/>
+            <w:tcW w:type="dxa" w:w="1530"/>
           </w:tcPr>
           <w:p>
             <w:r>
@@ -742,7 +660,7 @@
         </w:tc>
         <w:tc>
           <w:tcPr>
-            <w:tcW w:type="dxa" w:w="1360"/>
+            <w:tcW w:type="dxa" w:w="1530"/>
           </w:tcPr>
           <w:p>
             <w:r>
@@ -755,7 +673,7 @@
         </w:tc>
         <w:tc>
           <w:tcPr>
-            <w:tcW w:type="dxa" w:w="1360"/>
+            <w:tcW w:type="dxa" w:w="1530"/>
           </w:tcPr>
           <w:p>
             <w:r>
@@ -768,7 +686,7 @@
         </w:tc>
         <w:tc>
           <w:tcPr>
-            <w:tcW w:type="dxa" w:w="1360"/>
+            <w:tcW w:type="dxa" w:w="1530"/>
           </w:tcPr>
           <w:p>
             <w:r>
@@ -781,7 +699,7 @@
         </w:tc>
         <w:tc>
           <w:tcPr>
-            <w:tcW w:type="dxa" w:w="1360"/>
+            <w:tcW w:type="dxa" w:w="1530"/>
           </w:tcPr>
           <w:p>
             <w:r>
@@ -796,7 +714,7 @@
       <w:tr>
         <w:tc>
           <w:tcPr>
-            <w:tcW w:type="dxa" w:w="1360"/>
+            <w:tcW w:type="dxa" w:w="1530"/>
           </w:tcPr>
           <w:p>
             <w:r>
@@ -809,7 +727,7 @@
         </w:tc>
         <w:tc>
           <w:tcPr>
-            <w:tcW w:type="dxa" w:w="1360"/>
+            <w:tcW w:type="dxa" w:w="1530"/>
           </w:tcPr>
           <w:p>
             <w:r>
@@ -822,7 +740,7 @@
         </w:tc>
         <w:tc>
           <w:tcPr>
-            <w:tcW w:type="dxa" w:w="1360"/>
+            <w:tcW w:type="dxa" w:w="1530"/>
           </w:tcPr>
           <w:p>
             <w:r>
@@ -835,20 +753,7 @@
         </w:tc>
         <w:tc>
           <w:tcPr>
-            <w:tcW w:type="dxa" w:w="1360"/>
-          </w:tcPr>
-          <w:p>
-            <w:r>
-              <w:rPr>
-                <w:sz w:val="16"/>
-              </w:rPr>
-              <w:t>JTIK — Sinta 3</w:t>
-            </w:r>
-          </w:p>
-        </w:tc>
-        <w:tc>
-          <w:tcPr>
-            <w:tcW w:type="dxa" w:w="1360"/>
+            <w:tcW w:type="dxa" w:w="1530"/>
           </w:tcPr>
           <w:p>
             <w:r>
@@ -861,7 +766,7 @@
         </w:tc>
         <w:tc>
           <w:tcPr>
-            <w:tcW w:type="dxa" w:w="1360"/>
+            <w:tcW w:type="dxa" w:w="1530"/>
           </w:tcPr>
           <w:p>
             <w:r>
@@ -874,7 +779,7 @@
         </w:tc>
         <w:tc>
           <w:tcPr>
-            <w:tcW w:type="dxa" w:w="1360"/>
+            <w:tcW w:type="dxa" w:w="1530"/>
           </w:tcPr>
           <w:p>
             <w:r>
@@ -887,7 +792,7 @@
         </w:tc>
         <w:tc>
           <w:tcPr>
-            <w:tcW w:type="dxa" w:w="1360"/>
+            <w:tcW w:type="dxa" w:w="1530"/>
           </w:tcPr>
           <w:p>
             <w:r>
@@ -900,7 +805,7 @@
         </w:tc>
         <w:tc>
           <w:tcPr>
-            <w:tcW w:type="dxa" w:w="1360"/>
+            <w:tcW w:type="dxa" w:w="1530"/>
           </w:tcPr>
           <w:p>
             <w:r>
@@ -915,7 +820,7 @@
       <w:tr>
         <w:tc>
           <w:tcPr>
-            <w:tcW w:type="dxa" w:w="1360"/>
+            <w:tcW w:type="dxa" w:w="1530"/>
           </w:tcPr>
           <w:p>
             <w:r>
@@ -928,7 +833,7 @@
         </w:tc>
         <w:tc>
           <w:tcPr>
-            <w:tcW w:type="dxa" w:w="1360"/>
+            <w:tcW w:type="dxa" w:w="1530"/>
           </w:tcPr>
           <w:p>
             <w:r>
@@ -941,7 +846,7 @@
         </w:tc>
         <w:tc>
           <w:tcPr>
-            <w:tcW w:type="dxa" w:w="1360"/>
+            <w:tcW w:type="dxa" w:w="1530"/>
           </w:tcPr>
           <w:p>
             <w:r>
@@ -954,20 +859,7 @@
         </w:tc>
         <w:tc>
           <w:tcPr>
-            <w:tcW w:type="dxa" w:w="1360"/>
-          </w:tcPr>
-          <w:p>
-            <w:r>
-              <w:rPr>
-                <w:sz w:val="16"/>
-              </w:rPr>
-              <w:t>JUEE — Sinta 4</w:t>
-            </w:r>
-          </w:p>
-        </w:tc>
-        <w:tc>
-          <w:tcPr>
-            <w:tcW w:type="dxa" w:w="1360"/>
+            <w:tcW w:type="dxa" w:w="1530"/>
           </w:tcPr>
           <w:p>
             <w:r>
@@ -980,7 +872,7 @@
         </w:tc>
         <w:tc>
           <w:tcPr>
-            <w:tcW w:type="dxa" w:w="1360"/>
+            <w:tcW w:type="dxa" w:w="1530"/>
           </w:tcPr>
           <w:p>
             <w:r>
@@ -993,7 +885,7 @@
         </w:tc>
         <w:tc>
           <w:tcPr>
-            <w:tcW w:type="dxa" w:w="1360"/>
+            <w:tcW w:type="dxa" w:w="1530"/>
           </w:tcPr>
           <w:p>
             <w:r>
@@ -1006,7 +898,7 @@
         </w:tc>
         <w:tc>
           <w:tcPr>
-            <w:tcW w:type="dxa" w:w="1360"/>
+            <w:tcW w:type="dxa" w:w="1530"/>
           </w:tcPr>
           <w:p>
             <w:r>
@@ -1019,7 +911,7 @@
         </w:tc>
         <w:tc>
           <w:tcPr>
-            <w:tcW w:type="dxa" w:w="1360"/>
+            <w:tcW w:type="dxa" w:w="1530"/>
           </w:tcPr>
           <w:p>
             <w:r>
@@ -1034,7 +926,7 @@
       <w:tr>
         <w:tc>
           <w:tcPr>
-            <w:tcW w:type="dxa" w:w="1360"/>
+            <w:tcW w:type="dxa" w:w="1530"/>
           </w:tcPr>
           <w:p>
             <w:r>
@@ -1047,7 +939,7 @@
         </w:tc>
         <w:tc>
           <w:tcPr>
-            <w:tcW w:type="dxa" w:w="1360"/>
+            <w:tcW w:type="dxa" w:w="1530"/>
           </w:tcPr>
           <w:p>
             <w:r>
@@ -1060,7 +952,7 @@
         </w:tc>
         <w:tc>
           <w:tcPr>
-            <w:tcW w:type="dxa" w:w="1360"/>
+            <w:tcW w:type="dxa" w:w="1530"/>
           </w:tcPr>
           <w:p>
             <w:r>
@@ -1073,20 +965,7 @@
         </w:tc>
         <w:tc>
           <w:tcPr>
-            <w:tcW w:type="dxa" w:w="1360"/>
-          </w:tcPr>
-          <w:p>
-            <w:r>
-              <w:rPr>
-                <w:sz w:val="16"/>
-              </w:rPr>
-              <w:t>JALK — Sinta 4</w:t>
-            </w:r>
-          </w:p>
-        </w:tc>
-        <w:tc>
-          <w:tcPr>
-            <w:tcW w:type="dxa" w:w="1360"/>
+            <w:tcW w:type="dxa" w:w="1530"/>
           </w:tcPr>
           <w:p>
             <w:r>
@@ -1099,7 +978,7 @@
         </w:tc>
         <w:tc>
           <w:tcPr>
-            <w:tcW w:type="dxa" w:w="1360"/>
+            <w:tcW w:type="dxa" w:w="1530"/>
           </w:tcPr>
           <w:p>
             <w:r>
@@ -1112,7 +991,7 @@
         </w:tc>
         <w:tc>
           <w:tcPr>
-            <w:tcW w:type="dxa" w:w="1360"/>
+            <w:tcW w:type="dxa" w:w="1530"/>
           </w:tcPr>
           <w:p>
             <w:r>
@@ -1125,7 +1004,7 @@
         </w:tc>
         <w:tc>
           <w:tcPr>
-            <w:tcW w:type="dxa" w:w="1360"/>
+            <w:tcW w:type="dxa" w:w="1530"/>
           </w:tcPr>
           <w:p>
             <w:r>
@@ -1138,7 +1017,7 @@
         </w:tc>
         <w:tc>
           <w:tcPr>
-            <w:tcW w:type="dxa" w:w="1360"/>
+            <w:tcW w:type="dxa" w:w="1530"/>
           </w:tcPr>
           <w:p>
             <w:r>
@@ -1153,7 +1032,7 @@
       <w:tr>
         <w:tc>
           <w:tcPr>
-            <w:tcW w:type="dxa" w:w="1360"/>
+            <w:tcW w:type="dxa" w:w="1530"/>
           </w:tcPr>
           <w:p>
             <w:r>
@@ -1166,7 +1045,7 @@
         </w:tc>
         <w:tc>
           <w:tcPr>
-            <w:tcW w:type="dxa" w:w="1360"/>
+            <w:tcW w:type="dxa" w:w="1530"/>
           </w:tcPr>
           <w:p>
             <w:r>
@@ -1179,7 +1058,7 @@
         </w:tc>
         <w:tc>
           <w:tcPr>
-            <w:tcW w:type="dxa" w:w="1360"/>
+            <w:tcW w:type="dxa" w:w="1530"/>
           </w:tcPr>
           <w:p>
             <w:r>
@@ -1192,20 +1071,7 @@
         </w:tc>
         <w:tc>
           <w:tcPr>
-            <w:tcW w:type="dxa" w:w="1360"/>
-          </w:tcPr>
-          <w:p>
-            <w:r>
-              <w:rPr>
-                <w:sz w:val="16"/>
-              </w:rPr>
-              <w:t>JSTIT Unsri — Sinta 4</w:t>
-            </w:r>
-          </w:p>
-        </w:tc>
-        <w:tc>
-          <w:tcPr>
-            <w:tcW w:type="dxa" w:w="1360"/>
+            <w:tcW w:type="dxa" w:w="1530"/>
           </w:tcPr>
           <w:p>
             <w:r>
@@ -1218,7 +1084,7 @@
         </w:tc>
         <w:tc>
           <w:tcPr>
-            <w:tcW w:type="dxa" w:w="1360"/>
+            <w:tcW w:type="dxa" w:w="1530"/>
           </w:tcPr>
           <w:p>
             <w:r>
@@ -1231,7 +1097,7 @@
         </w:tc>
         <w:tc>
           <w:tcPr>
-            <w:tcW w:type="dxa" w:w="1360"/>
+            <w:tcW w:type="dxa" w:w="1530"/>
           </w:tcPr>
           <w:p>
             <w:r>
@@ -1244,7 +1110,7 @@
         </w:tc>
         <w:tc>
           <w:tcPr>
-            <w:tcW w:type="dxa" w:w="1360"/>
+            <w:tcW w:type="dxa" w:w="1530"/>
           </w:tcPr>
           <w:p>
             <w:r>
@@ -1257,7 +1123,7 @@
         </w:tc>
         <w:tc>
           <w:tcPr>
-            <w:tcW w:type="dxa" w:w="1360"/>
+            <w:tcW w:type="dxa" w:w="1530"/>
           </w:tcPr>
           <w:p>
             <w:r>
@@ -1272,7 +1138,7 @@
       <w:tr>
         <w:tc>
           <w:tcPr>
-            <w:tcW w:type="dxa" w:w="1360"/>
+            <w:tcW w:type="dxa" w:w="1530"/>
           </w:tcPr>
           <w:p>
             <w:r>
@@ -1285,7 +1151,7 @@
         </w:tc>
         <w:tc>
           <w:tcPr>
-            <w:tcW w:type="dxa" w:w="1360"/>
+            <w:tcW w:type="dxa" w:w="1530"/>
           </w:tcPr>
           <w:p>
             <w:r>
@@ -1298,7 +1164,7 @@
         </w:tc>
         <w:tc>
           <w:tcPr>
-            <w:tcW w:type="dxa" w:w="1360"/>
+            <w:tcW w:type="dxa" w:w="1530"/>
           </w:tcPr>
           <w:p>
             <w:r>
@@ -1311,20 +1177,7 @@
         </w:tc>
         <w:tc>
           <w:tcPr>
-            <w:tcW w:type="dxa" w:w="1360"/>
-          </w:tcPr>
-          <w:p>
-            <w:r>
-              <w:rPr>
-                <w:sz w:val="16"/>
-              </w:rPr>
-              <w:t>JIKO — Sinta 4</w:t>
-            </w:r>
-          </w:p>
-        </w:tc>
-        <w:tc>
-          <w:tcPr>
-            <w:tcW w:type="dxa" w:w="1360"/>
+            <w:tcW w:type="dxa" w:w="1530"/>
           </w:tcPr>
           <w:p>
             <w:r>
@@ -1337,7 +1190,7 @@
         </w:tc>
         <w:tc>
           <w:tcPr>
-            <w:tcW w:type="dxa" w:w="1360"/>
+            <w:tcW w:type="dxa" w:w="1530"/>
           </w:tcPr>
           <w:p>
             <w:r>
@@ -1350,7 +1203,7 @@
         </w:tc>
         <w:tc>
           <w:tcPr>
-            <w:tcW w:type="dxa" w:w="1360"/>
+            <w:tcW w:type="dxa" w:w="1530"/>
           </w:tcPr>
           <w:p>
             <w:r>
@@ -1363,7 +1216,7 @@
         </w:tc>
         <w:tc>
           <w:tcPr>
-            <w:tcW w:type="dxa" w:w="1360"/>
+            <w:tcW w:type="dxa" w:w="1530"/>
           </w:tcPr>
           <w:p>
             <w:r>
@@ -1376,7 +1229,7 @@
         </w:tc>
         <w:tc>
           <w:tcPr>
-            <w:tcW w:type="dxa" w:w="1360"/>
+            <w:tcW w:type="dxa" w:w="1530"/>
           </w:tcPr>
           <w:p>
             <w:r>

</xml_diff>